<commit_message>
Add Week 6 JavaScript business rule
Added the javasript as needed for session 1 group activity step 1
</commit_message>
<xml_diff>
--- a/docs/Milestone 1 Project Foundation/MIS3371-Business-Rules.docx
+++ b/docs/Milestone 1 Project Foundation/MIS3371-Business-Rules.docx
@@ -2952,6 +2952,23 @@
 </file>
 
 <file path=customXml/item1.xml><?xml version="1.0" encoding="utf-8"?>
+<p:properties xmlns:p="http://schemas.microsoft.com/office/2006/metadata/properties" xmlns:xsi="http://www.w3.org/2001/XMLSchema-instance" xmlns:pc="http://schemas.microsoft.com/office/infopath/2007/PartnerControls">
+  <documentManagement>
+    <_activity xmlns="68107622-43a1-49c8-a214-d129ef5e3b8c" xsi:nil="true"/>
+  </documentManagement>
+</p:properties>
+</file>
+
+<file path=customXml/item2.xml><?xml version="1.0" encoding="utf-8"?>
+<?mso-contentType ?>
+<FormTemplates xmlns="http://schemas.microsoft.com/sharepoint/v3/contenttype/forms">
+  <Display>DocumentLibraryForm</Display>
+  <Edit>DocumentLibraryForm</Edit>
+  <New>DocumentLibraryForm</New>
+</FormTemplates>
+</file>
+
+<file path=customXml/item3.xml><?xml version="1.0" encoding="utf-8"?>
 <ct:contentTypeSchema xmlns:ct="http://schemas.microsoft.com/office/2006/metadata/contentType" xmlns:ma="http://schemas.microsoft.com/office/2006/metadata/properties/metaAttributes" ct:_="" ma:_="" ma:contentTypeName="Document" ma:contentTypeID="0x010100112A4F20A68A3245B38AC9ED5E9EDED5" ma:contentTypeVersion="6" ma:contentTypeDescription="Create a new document." ma:contentTypeScope="" ma:versionID="bd3f642476fc6b4e2c845a5635fc7edb">
   <xsd:schema xmlns:xsd="http://www.w3.org/2001/XMLSchema" xmlns:xs="http://www.w3.org/2001/XMLSchema" xmlns:p="http://schemas.microsoft.com/office/2006/metadata/properties" xmlns:ns3="68107622-43a1-49c8-a214-d129ef5e3b8c" targetNamespace="http://schemas.microsoft.com/office/2006/metadata/properties" ma:root="true" ma:fieldsID="54157aad579c88213110e0868dfe51dd" ns3:_="">
     <xsd:import namespace="68107622-43a1-49c8-a214-d129ef5e3b8c"/>
@@ -3107,24 +3124,25 @@
 </ct:contentTypeSchema>
 </file>
 
-<file path=customXml/item2.xml><?xml version="1.0" encoding="utf-8"?>
-<?mso-contentType ?>
-<FormTemplates xmlns="http://schemas.microsoft.com/sharepoint/v3/contenttype/forms">
-  <Display>DocumentLibraryForm</Display>
-  <Edit>DocumentLibraryForm</Edit>
-  <New>DocumentLibraryForm</New>
-</FormTemplates>
+<file path=customXml/itemProps1.xml><?xml version="1.0" encoding="utf-8"?>
+<ds:datastoreItem xmlns:ds="http://schemas.openxmlformats.org/officeDocument/2006/customXml" ds:itemID="{A031E719-E81D-4DC9-B367-DC48A97BE808}">
+  <ds:schemaRefs>
+    <ds:schemaRef ds:uri="http://schemas.microsoft.com/office/2006/metadata/properties"/>
+    <ds:schemaRef ds:uri="http://schemas.microsoft.com/office/infopath/2007/PartnerControls"/>
+    <ds:schemaRef ds:uri="68107622-43a1-49c8-a214-d129ef5e3b8c"/>
+  </ds:schemaRefs>
+</ds:datastoreItem>
 </file>
 
-<file path=customXml/item3.xml><?xml version="1.0" encoding="utf-8"?>
-<p:properties xmlns:p="http://schemas.microsoft.com/office/2006/metadata/properties" xmlns:xsi="http://www.w3.org/2001/XMLSchema-instance" xmlns:pc="http://schemas.microsoft.com/office/infopath/2007/PartnerControls">
-  <documentManagement>
-    <_activity xmlns="68107622-43a1-49c8-a214-d129ef5e3b8c" xsi:nil="true"/>
-  </documentManagement>
-</p:properties>
+<file path=customXml/itemProps2.xml><?xml version="1.0" encoding="utf-8"?>
+<ds:datastoreItem xmlns:ds="http://schemas.openxmlformats.org/officeDocument/2006/customXml" ds:itemID="{8BE8F11F-4057-4434-A233-B313BF134855}">
+  <ds:schemaRefs>
+    <ds:schemaRef ds:uri="http://schemas.microsoft.com/sharepoint/v3/contenttype/forms"/>
+  </ds:schemaRefs>
+</ds:datastoreItem>
 </file>
 
-<file path=customXml/itemProps1.xml><?xml version="1.0" encoding="utf-8"?>
+<file path=customXml/itemProps3.xml><?xml version="1.0" encoding="utf-8"?>
 <ds:datastoreItem xmlns:ds="http://schemas.openxmlformats.org/officeDocument/2006/customXml" ds:itemID="{C4ED0EB2-69EF-41F1-B1C7-0B725D14A7BD}">
   <ds:schemaRefs>
     <ds:schemaRef ds:uri="http://schemas.microsoft.com/office/2006/metadata/contentType"/>
@@ -3140,22 +3158,4 @@
     <ds:schemaRef ds:uri="http://schemas.microsoft.com/internal/obd"/>
   </ds:schemaRefs>
 </ds:datastoreItem>
-</file>
-
-<file path=customXml/itemProps2.xml><?xml version="1.0" encoding="utf-8"?>
-<ds:datastoreItem xmlns:ds="http://schemas.openxmlformats.org/officeDocument/2006/customXml" ds:itemID="{8BE8F11F-4057-4434-A233-B313BF134855}">
-  <ds:schemaRefs>
-    <ds:schemaRef ds:uri="http://schemas.microsoft.com/sharepoint/v3/contenttype/forms"/>
-  </ds:schemaRefs>
-</ds:datastoreItem>
-</file>
-
-<file path=customXml/itemProps3.xml><?xml version="1.0" encoding="utf-8"?>
-<ds:datastoreItem xmlns:ds="http://schemas.openxmlformats.org/officeDocument/2006/customXml" ds:itemID="{A031E719-E81D-4DC9-B367-DC48A97BE808}">
-  <ds:schemaRefs>
-    <ds:schemaRef ds:uri="http://schemas.microsoft.com/office/2006/metadata/properties"/>
-    <ds:schemaRef ds:uri="http://schemas.microsoft.com/office/infopath/2007/PartnerControls"/>
-    <ds:schemaRef ds:uri="68107622-43a1-49c8-a214-d129ef5e3b8c"/>
-  </ds:schemaRefs>
-</ds:datastoreItem>
 </file>
</xml_diff>

<commit_message>
Changed the business rule to be 1 point = 0.10 dollars
</commit_message>
<xml_diff>
--- a/docs/Milestone 1 Project Foundation/MIS3371-Business-Rules.docx
+++ b/docs/Milestone 1 Project Foundation/MIS3371-Business-Rules.docx
@@ -127,7 +127,13 @@
         </w:numPr>
       </w:pPr>
       <w:r>
-        <w:t>1 point covers $1</w:t>
+        <w:t>1 point covers $</w:t>
+      </w:r>
+      <w:r>
+        <w:t>0.</w:t>
+      </w:r>
+      <w:r>
+        <w:t>1</w:t>
       </w:r>
     </w:p>
     <w:p>
@@ -2997,23 +3003,6 @@
 </file>
 
 <file path=customXml/item1.xml><?xml version="1.0" encoding="utf-8"?>
-<p:properties xmlns:p="http://schemas.microsoft.com/office/2006/metadata/properties" xmlns:xsi="http://www.w3.org/2001/XMLSchema-instance" xmlns:pc="http://schemas.microsoft.com/office/infopath/2007/PartnerControls">
-  <documentManagement>
-    <_activity xmlns="68107622-43a1-49c8-a214-d129ef5e3b8c" xsi:nil="true"/>
-  </documentManagement>
-</p:properties>
-</file>
-
-<file path=customXml/item2.xml><?xml version="1.0" encoding="utf-8"?>
-<?mso-contentType ?>
-<FormTemplates xmlns="http://schemas.microsoft.com/sharepoint/v3/contenttype/forms">
-  <Display>DocumentLibraryForm</Display>
-  <Edit>DocumentLibraryForm</Edit>
-  <New>DocumentLibraryForm</New>
-</FormTemplates>
-</file>
-
-<file path=customXml/item3.xml><?xml version="1.0" encoding="utf-8"?>
 <ct:contentTypeSchema xmlns:ct="http://schemas.microsoft.com/office/2006/metadata/contentType" xmlns:ma="http://schemas.microsoft.com/office/2006/metadata/properties/metaAttributes" ct:_="" ma:_="" ma:contentTypeName="Document" ma:contentTypeID="0x010100112A4F20A68A3245B38AC9ED5E9EDED5" ma:contentTypeVersion="6" ma:contentTypeDescription="Create a new document." ma:contentTypeScope="" ma:versionID="bd3f642476fc6b4e2c845a5635fc7edb">
   <xsd:schema xmlns:xsd="http://www.w3.org/2001/XMLSchema" xmlns:xs="http://www.w3.org/2001/XMLSchema" xmlns:p="http://schemas.microsoft.com/office/2006/metadata/properties" xmlns:ns3="68107622-43a1-49c8-a214-d129ef5e3b8c" targetNamespace="http://schemas.microsoft.com/office/2006/metadata/properties" ma:root="true" ma:fieldsID="54157aad579c88213110e0868dfe51dd" ns3:_="">
     <xsd:import namespace="68107622-43a1-49c8-a214-d129ef5e3b8c"/>
@@ -3169,25 +3158,24 @@
 </ct:contentTypeSchema>
 </file>
 
-<file path=customXml/itemProps1.xml><?xml version="1.0" encoding="utf-8"?>
-<ds:datastoreItem xmlns:ds="http://schemas.openxmlformats.org/officeDocument/2006/customXml" ds:itemID="{A031E719-E81D-4DC9-B367-DC48A97BE808}">
-  <ds:schemaRefs>
-    <ds:schemaRef ds:uri="http://schemas.microsoft.com/office/2006/metadata/properties"/>
-    <ds:schemaRef ds:uri="http://schemas.microsoft.com/office/infopath/2007/PartnerControls"/>
-    <ds:schemaRef ds:uri="68107622-43a1-49c8-a214-d129ef5e3b8c"/>
-  </ds:schemaRefs>
-</ds:datastoreItem>
+<file path=customXml/item2.xml><?xml version="1.0" encoding="utf-8"?>
+<?mso-contentType ?>
+<FormTemplates xmlns="http://schemas.microsoft.com/sharepoint/v3/contenttype/forms">
+  <Display>DocumentLibraryForm</Display>
+  <Edit>DocumentLibraryForm</Edit>
+  <New>DocumentLibraryForm</New>
+</FormTemplates>
 </file>
 
-<file path=customXml/itemProps2.xml><?xml version="1.0" encoding="utf-8"?>
-<ds:datastoreItem xmlns:ds="http://schemas.openxmlformats.org/officeDocument/2006/customXml" ds:itemID="{8BE8F11F-4057-4434-A233-B313BF134855}">
-  <ds:schemaRefs>
-    <ds:schemaRef ds:uri="http://schemas.microsoft.com/sharepoint/v3/contenttype/forms"/>
-  </ds:schemaRefs>
-</ds:datastoreItem>
+<file path=customXml/item3.xml><?xml version="1.0" encoding="utf-8"?>
+<p:properties xmlns:p="http://schemas.microsoft.com/office/2006/metadata/properties" xmlns:xsi="http://www.w3.org/2001/XMLSchema-instance" xmlns:pc="http://schemas.microsoft.com/office/infopath/2007/PartnerControls">
+  <documentManagement>
+    <_activity xmlns="68107622-43a1-49c8-a214-d129ef5e3b8c" xsi:nil="true"/>
+  </documentManagement>
+</p:properties>
 </file>
 
-<file path=customXml/itemProps3.xml><?xml version="1.0" encoding="utf-8"?>
+<file path=customXml/itemProps1.xml><?xml version="1.0" encoding="utf-8"?>
 <ds:datastoreItem xmlns:ds="http://schemas.openxmlformats.org/officeDocument/2006/customXml" ds:itemID="{C4ED0EB2-69EF-41F1-B1C7-0B725D14A7BD}">
   <ds:schemaRefs>
     <ds:schemaRef ds:uri="http://schemas.microsoft.com/office/2006/metadata/contentType"/>
@@ -3203,4 +3191,22 @@
     <ds:schemaRef ds:uri="http://schemas.microsoft.com/internal/obd"/>
   </ds:schemaRefs>
 </ds:datastoreItem>
+</file>
+
+<file path=customXml/itemProps2.xml><?xml version="1.0" encoding="utf-8"?>
+<ds:datastoreItem xmlns:ds="http://schemas.openxmlformats.org/officeDocument/2006/customXml" ds:itemID="{8BE8F11F-4057-4434-A233-B313BF134855}">
+  <ds:schemaRefs>
+    <ds:schemaRef ds:uri="http://schemas.microsoft.com/sharepoint/v3/contenttype/forms"/>
+  </ds:schemaRefs>
+</ds:datastoreItem>
+</file>
+
+<file path=customXml/itemProps3.xml><?xml version="1.0" encoding="utf-8"?>
+<ds:datastoreItem xmlns:ds="http://schemas.openxmlformats.org/officeDocument/2006/customXml" ds:itemID="{A031E719-E81D-4DC9-B367-DC48A97BE808}">
+  <ds:schemaRefs>
+    <ds:schemaRef ds:uri="http://schemas.microsoft.com/office/2006/metadata/properties"/>
+    <ds:schemaRef ds:uri="http://schemas.microsoft.com/office/infopath/2007/PartnerControls"/>
+    <ds:schemaRef ds:uri="68107622-43a1-49c8-a214-d129ef5e3b8c"/>
+  </ds:schemaRefs>
+</ds:datastoreItem>
 </file>
</xml_diff>

<commit_message>
Edited diagrams to make it more in line with the milestones
</commit_message>
<xml_diff>
--- a/docs/Milestone 1 Project Foundation/MIS3371-Business-Rules.docx
+++ b/docs/Milestone 1 Project Foundation/MIS3371-Business-Rules.docx
@@ -144,6 +144,17 @@
         </w:numPr>
       </w:pPr>
       <w:r>
+        <w:t>$1 spent = 1 point</w:t>
+      </w:r>
+    </w:p>
+    <w:p>
+      <w:pPr>
+        <w:numPr>
+          <w:ilvl w:val="0"/>
+          <w:numId w:val="6"/>
+        </w:numPr>
+      </w:pPr>
+      <w:r>
         <w:t>Fractional points are allowed</w:t>
       </w:r>
     </w:p>
@@ -312,6 +323,7 @@
           <w:b/>
           <w:bCs/>
         </w:rPr>
+        <w:lastRenderedPageBreak/>
         <w:t>Completed</w:t>
       </w:r>
       <w:r>
@@ -330,7 +342,6 @@
           <w:b/>
           <w:bCs/>
         </w:rPr>
-        <w:lastRenderedPageBreak/>
         <w:t>Rejected</w:t>
       </w:r>
       <w:r>
@@ -3003,6 +3014,23 @@
 </file>
 
 <file path=customXml/item1.xml><?xml version="1.0" encoding="utf-8"?>
+<p:properties xmlns:p="http://schemas.microsoft.com/office/2006/metadata/properties" xmlns:xsi="http://www.w3.org/2001/XMLSchema-instance" xmlns:pc="http://schemas.microsoft.com/office/infopath/2007/PartnerControls">
+  <documentManagement>
+    <_activity xmlns="68107622-43a1-49c8-a214-d129ef5e3b8c" xsi:nil="true"/>
+  </documentManagement>
+</p:properties>
+</file>
+
+<file path=customXml/item2.xml><?xml version="1.0" encoding="utf-8"?>
+<?mso-contentType ?>
+<FormTemplates xmlns="http://schemas.microsoft.com/sharepoint/v3/contenttype/forms">
+  <Display>DocumentLibraryForm</Display>
+  <Edit>DocumentLibraryForm</Edit>
+  <New>DocumentLibraryForm</New>
+</FormTemplates>
+</file>
+
+<file path=customXml/item3.xml><?xml version="1.0" encoding="utf-8"?>
 <ct:contentTypeSchema xmlns:ct="http://schemas.microsoft.com/office/2006/metadata/contentType" xmlns:ma="http://schemas.microsoft.com/office/2006/metadata/properties/metaAttributes" ct:_="" ma:_="" ma:contentTypeName="Document" ma:contentTypeID="0x010100112A4F20A68A3245B38AC9ED5E9EDED5" ma:contentTypeVersion="6" ma:contentTypeDescription="Create a new document." ma:contentTypeScope="" ma:versionID="bd3f642476fc6b4e2c845a5635fc7edb">
   <xsd:schema xmlns:xsd="http://www.w3.org/2001/XMLSchema" xmlns:xs="http://www.w3.org/2001/XMLSchema" xmlns:p="http://schemas.microsoft.com/office/2006/metadata/properties" xmlns:ns3="68107622-43a1-49c8-a214-d129ef5e3b8c" targetNamespace="http://schemas.microsoft.com/office/2006/metadata/properties" ma:root="true" ma:fieldsID="54157aad579c88213110e0868dfe51dd" ns3:_="">
     <xsd:import namespace="68107622-43a1-49c8-a214-d129ef5e3b8c"/>
@@ -3158,24 +3186,25 @@
 </ct:contentTypeSchema>
 </file>
 
-<file path=customXml/item2.xml><?xml version="1.0" encoding="utf-8"?>
-<?mso-contentType ?>
-<FormTemplates xmlns="http://schemas.microsoft.com/sharepoint/v3/contenttype/forms">
-  <Display>DocumentLibraryForm</Display>
-  <Edit>DocumentLibraryForm</Edit>
-  <New>DocumentLibraryForm</New>
-</FormTemplates>
+<file path=customXml/itemProps1.xml><?xml version="1.0" encoding="utf-8"?>
+<ds:datastoreItem xmlns:ds="http://schemas.openxmlformats.org/officeDocument/2006/customXml" ds:itemID="{A031E719-E81D-4DC9-B367-DC48A97BE808}">
+  <ds:schemaRefs>
+    <ds:schemaRef ds:uri="http://schemas.microsoft.com/office/2006/metadata/properties"/>
+    <ds:schemaRef ds:uri="http://schemas.microsoft.com/office/infopath/2007/PartnerControls"/>
+    <ds:schemaRef ds:uri="68107622-43a1-49c8-a214-d129ef5e3b8c"/>
+  </ds:schemaRefs>
+</ds:datastoreItem>
 </file>
 
-<file path=customXml/item3.xml><?xml version="1.0" encoding="utf-8"?>
-<p:properties xmlns:p="http://schemas.microsoft.com/office/2006/metadata/properties" xmlns:xsi="http://www.w3.org/2001/XMLSchema-instance" xmlns:pc="http://schemas.microsoft.com/office/infopath/2007/PartnerControls">
-  <documentManagement>
-    <_activity xmlns="68107622-43a1-49c8-a214-d129ef5e3b8c" xsi:nil="true"/>
-  </documentManagement>
-</p:properties>
+<file path=customXml/itemProps2.xml><?xml version="1.0" encoding="utf-8"?>
+<ds:datastoreItem xmlns:ds="http://schemas.openxmlformats.org/officeDocument/2006/customXml" ds:itemID="{8BE8F11F-4057-4434-A233-B313BF134855}">
+  <ds:schemaRefs>
+    <ds:schemaRef ds:uri="http://schemas.microsoft.com/sharepoint/v3/contenttype/forms"/>
+  </ds:schemaRefs>
+</ds:datastoreItem>
 </file>
 
-<file path=customXml/itemProps1.xml><?xml version="1.0" encoding="utf-8"?>
+<file path=customXml/itemProps3.xml><?xml version="1.0" encoding="utf-8"?>
 <ds:datastoreItem xmlns:ds="http://schemas.openxmlformats.org/officeDocument/2006/customXml" ds:itemID="{C4ED0EB2-69EF-41F1-B1C7-0B725D14A7BD}">
   <ds:schemaRefs>
     <ds:schemaRef ds:uri="http://schemas.microsoft.com/office/2006/metadata/contentType"/>
@@ -3191,22 +3220,4 @@
     <ds:schemaRef ds:uri="http://schemas.microsoft.com/internal/obd"/>
   </ds:schemaRefs>
 </ds:datastoreItem>
-</file>
-
-<file path=customXml/itemProps2.xml><?xml version="1.0" encoding="utf-8"?>
-<ds:datastoreItem xmlns:ds="http://schemas.openxmlformats.org/officeDocument/2006/customXml" ds:itemID="{8BE8F11F-4057-4434-A233-B313BF134855}">
-  <ds:schemaRefs>
-    <ds:schemaRef ds:uri="http://schemas.microsoft.com/sharepoint/v3/contenttype/forms"/>
-  </ds:schemaRefs>
-</ds:datastoreItem>
-</file>
-
-<file path=customXml/itemProps3.xml><?xml version="1.0" encoding="utf-8"?>
-<ds:datastoreItem xmlns:ds="http://schemas.openxmlformats.org/officeDocument/2006/customXml" ds:itemID="{A031E719-E81D-4DC9-B367-DC48A97BE808}">
-  <ds:schemaRefs>
-    <ds:schemaRef ds:uri="http://schemas.microsoft.com/office/2006/metadata/properties"/>
-    <ds:schemaRef ds:uri="http://schemas.microsoft.com/office/infopath/2007/PartnerControls"/>
-    <ds:schemaRef ds:uri="68107622-43a1-49c8-a214-d129ef5e3b8c"/>
-  </ds:schemaRefs>
-</ds:datastoreItem>
 </file>
</xml_diff>